<commit_message>
simple ar1/ma1 benchmark results and edits to manuscript
</commit_message>
<xml_diff>
--- a/FisheriesResearch_manuscript/manuscript.docx
+++ b/FisheriesResearch_manuscript/manuscript.docx
@@ -237,6 +237,12 @@
         <w:t xml:space="preserve"> </w:t>
       </w:r>
       <w:r>
+        <w:t xml:space="preserve">J.</w:t>
+      </w:r>
+      <w:r>
+        <w:t xml:space="preserve"> </w:t>
+      </w:r>
+      <w:r>
         <w:t xml:space="preserve">Ward</w:t>
       </w:r>
       <m:oMath>
@@ -268,7 +274,7 @@
         <w:pStyle w:val="Date"/>
       </w:pPr>
       <w:r>
-        <w:t xml:space="preserve">May</w:t>
+        <w:t xml:space="preserve">June</w:t>
       </w:r>
       <w:r>
         <w:t xml:space="preserve"> </w:t>
@@ -489,7 +495,7 @@
         <w:br/>
       </w:r>
       <w:r>
-        <w:t xml:space="preserve">Many stock assessment models in the U.S. were developed in ADMB using a hierarchical approach for time-varying processes. Mean parameter values</w:t>
+        <w:t xml:space="preserve">Many stock assessment models in the U.S. have been developed in ADMB using a hierarchical approach for time-varying processes, where mean parameter values</w:t>
       </w:r>
       <w:r>
         <w:t xml:space="preserve"> </w:t>
@@ -662,7 +668,7 @@
         <w:t xml:space="preserve"> </w:t>
       </w:r>
       <w:r>
-        <w:t xml:space="preserve">estimate. Due to this difference, the deviations approach in a random effects model has a much larger computational penalty than in historic fixed effects modeling platforms. We test an alternate configuration of directly estimating annual recruitment values as random effects. This structure has a sparse covariance matrix and reduces model estimation time. Optimization time and parameter estimates from stock assessment models under these equivalent sparse versus dense parameterizations are compared to confirm equivalency and performance improvement of the new structure. These results inform development in next generation stock assessment models.</w:t>
+        <w:t xml:space="preserve">estimate. Due to this difference, the deviations approach in a random effects model has a much larger computational penalty than in historic fixed effects modeling platforms. We test an alternate configuration of directly estimating annual recruitment values as random effects in AR1 and MA1 processes. While the former structure has a sparse covariance matrix and reduces model estimation time, the latter produces the opposite result. Optimization time and parameter estimates from stock assessment models under these equivalent sparse versus dense parameterizations are compared to confirm equivalency and performance improvement of the new structure. These results inform development in next generation stock assessment models.</w:t>
       </w:r>
     </w:p>
     <w:bookmarkEnd w:id="21"/>
@@ -938,7 +944,7 @@
       </w:r>
     </w:p>
     <w:bookmarkEnd w:id="24"/>
-    <w:bookmarkStart w:id="25" w:name="introduction"/>
+    <w:bookmarkStart w:id="29" w:name="introduction"/>
     <w:p>
       <w:pPr>
         <w:pStyle w:val="Heading1"/>
@@ -961,11 +967,431 @@
         <w:pStyle w:val="FirstParagraph"/>
       </w:pPr>
       <w:r>
-        <w:t xml:space="preserve">Fishery stock assessment models in the United States provide options for modeling biological processes, such as recruitment, natural mortality, selectivity, and recruitment as time-varying. When models are based in ADMB, the common structural form of the time-varying process is hierarchical, where a vector of log-deviations typically follow a normal distribution with a fixed standard deviation value. These values are then exponentiated and multiplied by the mean of the process, which can either be a single mean parameter or an output from a functional form (e.g. Beverton Holt recruitment), resulting in a vector of parameters that are unique for each time step. Models utilizing this approach have predominantly implemented log-deviations as estimated fixed effects and .</w:t>
-      </w:r>
-    </w:p>
-    <w:bookmarkEnd w:id="25"/>
-    <w:bookmarkStart w:id="30" w:name="methods"/>
+        <w:t xml:space="preserve">Drawing from the Bayesian literature, it is clear that model efficiency is not merely a matter of software implementation but is fundamentally tied to the geometric properties of the posterior distribution. In MCMC sampling, particularly within the Hamiltonian Monte Carlo (HMC) framework utilized by Stan, the choice between centered and non-centered parameterizations is often a response to the funnel geometry pathology (Betancourt &amp; Girolami, 2015). This pathology occurs when a sampler struggles to explore the narrow regions of a distribution where the group-level variance is small – a common issue in hierarchical models with sparse data (Monnahan et al., 2016). Specifically, a non-centered parameterization effectively stretches this funnel, allowing HMC to sample more efficiently by breaking the strong a priori dependence between hierarchical levels (Gorinova et al., 2019). However, if the data are highly informative, a centered parameterization may actually be more efficient, as the data can</w:t>
+      </w:r>
+      <w:r>
+        <w:t xml:space="preserve"> </w:t>
+      </w:r>
+      <w:r>
+        <w:t xml:space="preserve">“</w:t>
+      </w:r>
+      <w:r>
+        <w:t xml:space="preserve">pin down</w:t>
+      </w:r>
+      <w:r>
+        <w:t xml:space="preserve">”</w:t>
+      </w:r>
+      <w:r>
+        <w:t xml:space="preserve"> </w:t>
+      </w:r>
+      <w:r>
+        <w:t xml:space="preserve">the parameters and reduce the correlations that otherwise slow down the sampler (Papaspiliopoulos et al., 2007; Gorinova et al., 2019).</w:t>
+      </w:r>
+    </w:p>
+    <w:p>
+      <w:pPr>
+        <w:pStyle w:val="BodyText"/>
+      </w:pPr>
+      <w:r>
+        <w:t xml:space="preserve">Within the context of fisheries stock assessment models, there are many examples of hierarchical variables being estimated with centered or non-centered pararmeterizations; one of the clearest example of this is when variability is added to recruitment either by modeling the process itself,</w:t>
+      </w:r>
+      <w:r>
+        <w:t xml:space="preserve"> </w:t>
+      </w:r>
+      <m:oMath>
+        <m:r>
+          <m:t>r</m:t>
+        </m:r>
+        <m:r>
+          <m:t>e</m:t>
+        </m:r>
+        <m:r>
+          <m:t>c</m:t>
+        </m:r>
+        <m:r>
+          <m:t>r</m:t>
+        </m:r>
+        <m:r>
+          <m:t>u</m:t>
+        </m:r>
+        <m:r>
+          <m:t>i</m:t>
+        </m:r>
+        <m:r>
+          <m:t>t</m:t>
+        </m:r>
+        <m:r>
+          <m:t>m</m:t>
+        </m:r>
+        <m:r>
+          <m:t>e</m:t>
+        </m:r>
+        <m:r>
+          <m:t>n</m:t>
+        </m:r>
+        <m:r>
+          <m:t>t</m:t>
+        </m:r>
+        <m:r>
+          <m:t> </m:t>
+        </m:r>
+        <m:r>
+          <m:t>N</m:t>
+        </m:r>
+        <m:d>
+          <m:dPr>
+            <m:begChr m:val="("/>
+            <m:endChr m:val=")"/>
+            <m:sepChr m:val=""/>
+            <m:grow/>
+          </m:dPr>
+          <m:e>
+            <m:sSub>
+              <m:e>
+                <m:r>
+                  <m:t>μ</m:t>
+                </m:r>
+              </m:e>
+              <m:sub>
+                <m:r>
+                  <m:t>r</m:t>
+                </m:r>
+              </m:sub>
+            </m:sSub>
+            <m:r>
+              <m:rPr>
+                <m:sty m:val="p"/>
+              </m:rPr>
+              <m:t>,</m:t>
+            </m:r>
+            <m:sSub>
+              <m:e>
+                <m:r>
+                  <m:t>σ</m:t>
+                </m:r>
+              </m:e>
+              <m:sub>
+                <m:r>
+                  <m:t>r</m:t>
+                </m:r>
+              </m:sub>
+            </m:sSub>
+          </m:e>
+        </m:d>
+      </m:oMath>
+      <w:r>
+        <w:t xml:space="preserve"> </w:t>
+      </w:r>
+      <w:r>
+        <w:t xml:space="preserve">(centered parameterization), or by modeling the deviations around a mean,</w:t>
+      </w:r>
+      <w:r>
+        <w:t xml:space="preserve"> </w:t>
+      </w:r>
+      <m:oMath>
+        <m:r>
+          <m:t>d</m:t>
+        </m:r>
+        <m:r>
+          <m:t>e</m:t>
+        </m:r>
+        <m:r>
+          <m:t>v</m:t>
+        </m:r>
+        <m:r>
+          <m:t>i</m:t>
+        </m:r>
+        <m:r>
+          <m:t>a</m:t>
+        </m:r>
+        <m:r>
+          <m:t>t</m:t>
+        </m:r>
+        <m:r>
+          <m:t>i</m:t>
+        </m:r>
+        <m:r>
+          <m:t>o</m:t>
+        </m:r>
+        <m:r>
+          <m:t>n</m:t>
+        </m:r>
+        <m:r>
+          <m:t>s</m:t>
+        </m:r>
+        <m:r>
+          <m:t> </m:t>
+        </m:r>
+        <m:r>
+          <m:t>N</m:t>
+        </m:r>
+        <m:d>
+          <m:dPr>
+            <m:begChr m:val="("/>
+            <m:endChr m:val=")"/>
+            <m:sepChr m:val=""/>
+            <m:grow/>
+          </m:dPr>
+          <m:e>
+            <m:r>
+              <m:t>0</m:t>
+            </m:r>
+            <m:r>
+              <m:rPr>
+                <m:sty m:val="p"/>
+              </m:rPr>
+              <m:t>,</m:t>
+            </m:r>
+            <m:sSub>
+              <m:e>
+                <m:r>
+                  <m:t>σ</m:t>
+                </m:r>
+              </m:e>
+              <m:sub>
+                <m:r>
+                  <m:t>r</m:t>
+                </m:r>
+              </m:sub>
+            </m:sSub>
+          </m:e>
+        </m:d>
+        <m:r>
+          <m:rPr>
+            <m:sty m:val="p"/>
+          </m:rPr>
+          <m:t>,</m:t>
+        </m:r>
+        <m:r>
+          <m:t>r</m:t>
+        </m:r>
+        <m:r>
+          <m:t>e</m:t>
+        </m:r>
+        <m:r>
+          <m:t>c</m:t>
+        </m:r>
+        <m:r>
+          <m:t>r</m:t>
+        </m:r>
+        <m:r>
+          <m:t>u</m:t>
+        </m:r>
+        <m:r>
+          <m:t>i</m:t>
+        </m:r>
+        <m:r>
+          <m:t>t</m:t>
+        </m:r>
+        <m:r>
+          <m:t>m</m:t>
+        </m:r>
+        <m:r>
+          <m:t>e</m:t>
+        </m:r>
+        <m:r>
+          <m:t>n</m:t>
+        </m:r>
+        <m:r>
+          <m:t>t</m:t>
+        </m:r>
+        <m:r>
+          <m:rPr>
+            <m:sty m:val="p"/>
+          </m:rPr>
+          <m:t>=</m:t>
+        </m:r>
+        <m:sSub>
+          <m:e>
+            <m:r>
+              <m:t>μ</m:t>
+            </m:r>
+          </m:e>
+          <m:sub>
+            <m:r>
+              <m:t>r</m:t>
+            </m:r>
+          </m:sub>
+        </m:sSub>
+        <m:r>
+          <m:rPr>
+            <m:sty m:val="p"/>
+          </m:rPr>
+          <m:t>*</m:t>
+        </m:r>
+        <m:sSub>
+          <m:e>
+            <m:r>
+              <m:t>σ</m:t>
+            </m:r>
+          </m:e>
+          <m:sub>
+            <m:r>
+              <m:t>r</m:t>
+            </m:r>
+          </m:sub>
+        </m:sSub>
+      </m:oMath>
+      <w:r>
+        <w:t xml:space="preserve"> </w:t>
+      </w:r>
+      <w:r>
+        <w:t xml:space="preserve">(non-centered parameterizations). Historically, models reliant on ADMB estimate the deviations as fixed effects undered a constrained optimization where the variance,</w:t>
+      </w:r>
+      <w:r>
+        <w:t xml:space="preserve"> </w:t>
+      </w:r>
+      <m:oMath>
+        <m:sSub>
+          <m:e>
+            <m:r>
+              <m:t>σ</m:t>
+            </m:r>
+          </m:e>
+          <m:sub>
+            <m:r>
+              <m:t>r</m:t>
+            </m:r>
+          </m:sub>
+        </m:sSub>
+      </m:oMath>
+      <w:r>
+        <w:t xml:space="preserve"> </w:t>
+      </w:r>
+      <w:r>
+        <w:t xml:space="preserve">is fixed. In several tools, such as Stock Synthesis, sum to zero constraints have been applied to ensure that Hessian matrices are positive definite. A fixed-effect vector of deviation parameters does not require second order partial derivatives to be estimated until model optimization is complete and variance is estimated.</w:t>
+      </w:r>
+    </w:p>
+    <w:p>
+      <w:pPr>
+        <w:pStyle w:val="BodyText"/>
+      </w:pPr>
+      <w:r>
+        <w:t xml:space="preserve">Several next generation stock assessment models have changed dependency from ADMB to Template Model Builder (Kristensen et al., 2016) in order to incorporate the use of the Laplace approximation to integrate out hierarchical variables (i.e. random effects), allowing the estimation of the hierarchical variance parameter, e.g. </w:t>
+      </w:r>
+      <m:oMath>
+        <m:sSub>
+          <m:e>
+            <m:r>
+              <m:t>σ</m:t>
+            </m:r>
+          </m:e>
+          <m:sub>
+            <m:r>
+              <m:t>r</m:t>
+            </m:r>
+          </m:sub>
+        </m:sSub>
+      </m:oMath>
+      <w:r>
+        <w:t xml:space="preserve"> </w:t>
+      </w:r>
+      <w:r>
+        <w:t xml:space="preserve">(SAM, WHAM, FIMS). The Laplace approximation requires up to third-order derivates for its evaluations, thus necessitating a Jacobian calculation and Hessian inversion at each optimization step.</w:t>
+      </w:r>
+    </w:p>
+    <w:p>
+      <w:pPr>
+        <w:pStyle w:val="BodyText"/>
+      </w:pPr>
+      <w:r>
+        <w:t xml:space="preserve">To quantify the magnitude of this penalty we investigate the performance and optimization time of a simple random effects model under equivalent sparse vs dense parameterizations. For this example we utilize two simple proxy models; an auto regressive AR1 function and a simple stock assessment model based on babySAM. These proxies should reflect the relative performance gains expected in the real-world correlated time-varying processes modeled in stock assessments such as recruitment. Each of these time-series models can be parameterized as a dense matrix, representing the traditional parameter deviations as a random-effects approach, or as a sparse matrix, as would be achieved by directly estimating annual parameter values as random effects.</w:t>
+      </w:r>
+    </w:p>
+    <w:p>
+      <w:pPr>
+        <w:pStyle w:val="BodyText"/>
+      </w:pPr>
+      <w:r>
+        <w:t xml:space="preserve">These two approaches are anticipated to produce mathematically equivalent results while differing in their computational overhead. Confirming this equivalency and quantifying the runtime improvement will provide support for the change in approach relative to previous assessment models.</w:t>
+      </w:r>
+    </w:p>
+    <w:p>
+      <w:pPr>
+        <w:pStyle w:val="BodyText"/>
+      </w:pPr>
+      <w:r>
+        <w:t xml:space="preserve">Betancourt, M., &amp; Girolami, M. (2015).</w:t>
+      </w:r>
+      <w:r>
+        <w:t xml:space="preserve"> </w:t>
+      </w:r>
+      <w:hyperlink r:id="rId25">
+        <w:r>
+          <w:rPr>
+            <w:rStyle w:val="Hyperlink"/>
+          </w:rPr>
+          <w:t xml:space="preserve">https://arxiv.org/abs/1312.0906</w:t>
+        </w:r>
+      </w:hyperlink>
+    </w:p>
+    <w:p>
+      <w:pPr>
+        <w:pStyle w:val="BodyText"/>
+      </w:pPr>
+      <w:r>
+        <w:t xml:space="preserve">Gorinova 2019</w:t>
+      </w:r>
+      <w:r>
+        <w:t xml:space="preserve"> </w:t>
+      </w:r>
+      <w:hyperlink r:id="rId26">
+        <w:r>
+          <w:rPr>
+            <w:rStyle w:val="Hyperlink"/>
+          </w:rPr>
+          <w:t xml:space="preserve">https://doi.org/10.48550/arxiv.1906.03028</w:t>
+        </w:r>
+      </w:hyperlink>
+    </w:p>
+    <w:p>
+      <w:pPr>
+        <w:pStyle w:val="BodyText"/>
+      </w:pPr>
+      <w:r>
+        <w:t xml:space="preserve">Papaspiliopoulos 2007</w:t>
+      </w:r>
+      <w:r>
+        <w:t xml:space="preserve"> </w:t>
+      </w:r>
+      <w:hyperlink r:id="rId27">
+        <w:r>
+          <w:rPr>
+            <w:rStyle w:val="Hyperlink"/>
+          </w:rPr>
+          <w:t xml:space="preserve">https://projecteuclid.org/journals/statistical-science/volume-22/issue-1/A-General-Framework-for-the-Parametrization-of-Hierarchical-Models/10.1214/088342307000000014.full</w:t>
+        </w:r>
+      </w:hyperlink>
+    </w:p>
+    <w:p>
+      <w:pPr>
+        <w:pStyle w:val="BodyText"/>
+      </w:pPr>
+      <w:r>
+        <w:t xml:space="preserve">Kristensen et al. (2016)</w:t>
+      </w:r>
+      <w:r>
+        <w:t xml:space="preserve"> </w:t>
+      </w:r>
+      <w:hyperlink r:id="rId28">
+        <w:r>
+          <w:rPr>
+            <w:rStyle w:val="Hyperlink"/>
+          </w:rPr>
+          <w:t xml:space="preserve">https:://doi.org/10.18637/jss.v070.i05</w:t>
+        </w:r>
+      </w:hyperlink>
+    </w:p>
+    <w:p>
+      <w:pPr>
+        <w:pStyle w:val="BodyText"/>
+      </w:pPr>
+      <w:r>
+        <w:t xml:space="preserve">EW: Could add ecological refs</w:t>
+      </w:r>
+    </w:p>
+    <w:bookmarkEnd w:id="29"/>
+    <w:bookmarkStart w:id="34" w:name="methods"/>
     <w:p>
       <w:pPr>
         <w:pStyle w:val="Heading1"/>
@@ -983,7 +1409,7 @@
         <w:t xml:space="preserve">Methods</w:t>
       </w:r>
     </w:p>
-    <w:bookmarkStart w:id="26" w:name="simulation-models"/>
+    <w:bookmarkStart w:id="30" w:name="simulation-models"/>
     <w:p>
       <w:pPr>
         <w:pStyle w:val="Heading2"/>
@@ -2095,8 +2521,8 @@
         <w:t xml:space="preserve">.</w:t>
       </w:r>
     </w:p>
-    <w:bookmarkEnd w:id="26"/>
-    <w:bookmarkStart w:id="28" w:name="estimation"/>
+    <w:bookmarkEnd w:id="30"/>
+    <w:bookmarkStart w:id="32" w:name="estimation"/>
     <w:p>
       <w:pPr>
         <w:pStyle w:val="Heading2"/>
@@ -2869,8 +3295,8 @@
       <w:pPr>
         <w:pStyle w:val="TableCaption"/>
       </w:pPr>
-      <w:bookmarkStart w:id="27" w:name="tab:table1"/>
-      <w:bookmarkEnd w:id="27"/>
+      <w:bookmarkStart w:id="31" w:name="tab:table1"/>
+      <w:bookmarkEnd w:id="31"/>
       <w:r>
         <w:t xml:space="preserve">Table 3.1: Summary of model implementations.</w:t>
       </w:r>
@@ -3214,8 +3640,8 @@
         </w:tc>
       </w:tr>
     </w:tbl>
-    <w:bookmarkEnd w:id="28"/>
-    <w:bookmarkStart w:id="29" w:name="summary-statistics"/>
+    <w:bookmarkEnd w:id="32"/>
+    <w:bookmarkStart w:id="33" w:name="summary-statistics"/>
     <w:p>
       <w:pPr>
         <w:pStyle w:val="Heading2"/>
@@ -3304,9 +3730,9 @@
         <w:t xml:space="preserve">presented as mean (SD) across replicates.</w:t>
       </w:r>
     </w:p>
-    <w:bookmarkEnd w:id="29"/>
-    <w:bookmarkEnd w:id="30"/>
-    <w:bookmarkStart w:id="38" w:name="results"/>
+    <w:bookmarkEnd w:id="33"/>
+    <w:bookmarkEnd w:id="34"/>
+    <w:bookmarkStart w:id="42" w:name="results"/>
     <w:p>
       <w:pPr>
         <w:pStyle w:val="Heading1"/>
@@ -3324,7 +3750,7 @@
         <w:t xml:space="preserve">Results</w:t>
       </w:r>
     </w:p>
-    <w:bookmarkStart w:id="33" w:name="ma1-models"/>
+    <w:bookmarkStart w:id="37" w:name="ma1-models"/>
     <w:p>
       <w:pPr>
         <w:pStyle w:val="Heading3"/>
@@ -3398,7 +3824,7 @@
         <w:t xml:space="preserve"> </w:t>
       </w:r>
       <w:r>
-        <w:t xml:space="preserve">3.21</w:t>
+        <w:t xml:space="preserve">1.61</w:t>
       </w:r>
       <w:r>
         <w:t xml:space="preserve"> </w:t>
@@ -3437,75 +3863,15 @@
         <w:t xml:space="preserve"> </w:t>
       </w:r>
       <w:r>
-        <w:t xml:space="preserve">Stan and tmbstan implementations had similar speeds between random</w:t>
-      </w:r>
-      <w:r>
-        <w:t xml:space="preserve"> </w:t>
-      </w:r>
-      <w:r>
-        <w:t xml:space="preserve">effect implementations (good vs bad). The largest differences in our</w:t>
-      </w:r>
-      <w:r>
-        <w:t xml:space="preserve"> </w:t>
-      </w:r>
-      <w:r>
-        <w:t xml:space="preserve">comparison were between Stan and tmbstan; Stan models finished in less</w:t>
-      </w:r>
-      <w:r>
-        <w:t xml:space="preserve"> </w:t>
-      </w:r>
-      <w:r>
-        <w:t xml:space="preserve">than half the time</w:t>
-      </w:r>
-      <w:r>
-        <w:t xml:space="preserve"> </w:t>
-      </w:r>
-      <w:r>
-        <w:t xml:space="preserve">(2.19</w:t>
-      </w:r>
-      <w:r>
-        <w:t xml:space="preserve"> </w:t>
-      </w:r>
-      <w:r>
-        <w:t xml:space="preserve">times for the bad model,</w:t>
-      </w:r>
-      <w:r>
-        <w:t xml:space="preserve"> </w:t>
-      </w:r>
-      <w:r>
-        <w:t xml:space="preserve">2.3</w:t>
-      </w:r>
-      <w:r>
-        <w:t xml:space="preserve"> </w:t>
-      </w:r>
-      <w:r>
-        <w:t xml:space="preserve">for the good model), and had a much higher effective sample size. The</w:t>
-      </w:r>
-      <w:r>
-        <w:t xml:space="preserve"> </w:t>
-      </w:r>
-      <w:r>
-        <w:t xml:space="preserve">choice of random effects had no impact on the number of models converged</w:t>
-      </w:r>
-      <w:r>
-        <w:t xml:space="preserve"> </w:t>
-      </w:r>
-      <w:r>
-        <w:t xml:space="preserve">in Stan (n = 93) but modeling recruitment as random effects resulted in</w:t>
-      </w:r>
-      <w:r>
-        <w:t xml:space="preserve"> </w:t>
-      </w:r>
-      <w:r>
-        <w:t xml:space="preserve">more models converging (n = 97 v 89).</w:t>
+        <w:t xml:space="preserve">Stan and tmbstan implementations had similar average speeds across the two implementations, however the Stan models were slower on average than tmbstan (93 vs 65 seconds in tmbstan for the deviations approach; 70 vs 58 seconds in tmbstan for the recruitment approach).</w:t>
       </w:r>
     </w:p>
     <w:p>
       <w:pPr>
         <w:pStyle w:val="TableCaption"/>
       </w:pPr>
-      <w:bookmarkStart w:id="31" w:name="tab:table-ma-good"/>
-      <w:bookmarkEnd w:id="31"/>
+      <w:bookmarkStart w:id="35" w:name="tab:table-ma-good"/>
+      <w:bookmarkEnd w:id="35"/>
       <w:r>
         <w:t xml:space="preserve">Table 4.1: MA(1) implementation, with deviations as random effects. Mean (SD) across 100 replicates.</w:t>
       </w:r>
@@ -3598,31 +3964,31 @@
               <w:jc w:val="right"/>
             </w:pPr>
             <w:r>
-              <w:t xml:space="preserve">0.04 (0.00)</w:t>
-            </w:r>
-          </w:p>
-        </w:tc>
-        <w:tc>
-          <w:tcPr/>
-          <w:p>
-            <w:pPr>
-              <w:pStyle w:val="Compact"/>
-              <w:jc w:val="right"/>
-            </w:pPr>
-            <w:r>
-              <w:t xml:space="preserve">75.13 (16.44)</w:t>
-            </w:r>
-          </w:p>
-        </w:tc>
-        <w:tc>
-          <w:tcPr/>
-          <w:p>
-            <w:pPr>
-              <w:pStyle w:val="Compact"/>
-              <w:jc w:val="right"/>
-            </w:pPr>
-            <w:r>
-              <w:t xml:space="preserve">35.46 (18.22)</w:t>
+              <w:t xml:space="preserve">0.09 (0.00)</w:t>
+            </w:r>
+          </w:p>
+        </w:tc>
+        <w:tc>
+          <w:tcPr/>
+          <w:p>
+            <w:pPr>
+              <w:pStyle w:val="Compact"/>
+              <w:jc w:val="right"/>
+            </w:pPr>
+            <w:r>
+              <w:t xml:space="preserve">65.28 (8.10)</w:t>
+            </w:r>
+          </w:p>
+        </w:tc>
+        <w:tc>
+          <w:tcPr/>
+          <w:p>
+            <w:pPr>
+              <w:pStyle w:val="Compact"/>
+              <w:jc w:val="right"/>
+            </w:pPr>
+            <w:r>
+              <w:t xml:space="preserve">93.03 (25.82)</w:t>
             </w:r>
           </w:p>
         </w:tc>
@@ -3660,19 +4026,19 @@
               <w:jc w:val="right"/>
             </w:pPr>
             <w:r>
-              <w:t xml:space="preserve">2200.63 (395.97)</w:t>
-            </w:r>
-          </w:p>
-        </w:tc>
-        <w:tc>
-          <w:tcPr/>
-          <w:p>
-            <w:pPr>
-              <w:pStyle w:val="Compact"/>
-              <w:jc w:val="right"/>
-            </w:pPr>
-            <w:r>
-              <w:t xml:space="preserve">6247.65 (800.88)</w:t>
+              <w:t xml:space="preserve">2136.73 (248.34)</w:t>
+            </w:r>
+          </w:p>
+        </w:tc>
+        <w:tc>
+          <w:tcPr/>
+          <w:p>
+            <w:pPr>
+              <w:pStyle w:val="Compact"/>
+              <w:jc w:val="right"/>
+            </w:pPr>
+            <w:r>
+              <w:t xml:space="preserve">2222.04 (394.01)</w:t>
             </w:r>
           </w:p>
         </w:tc>
@@ -3710,19 +4076,19 @@
               <w:jc w:val="right"/>
             </w:pPr>
             <w:r>
-              <w:t xml:space="preserve">1.12 (4.79)</w:t>
-            </w:r>
-          </w:p>
-        </w:tc>
-        <w:tc>
-          <w:tcPr/>
-          <w:p>
-            <w:pPr>
-              <w:pStyle w:val="Compact"/>
-              <w:jc w:val="right"/>
-            </w:pPr>
-            <w:r>
-              <w:t xml:space="preserve">1.24 (5.09)</w:t>
+              <w:t xml:space="preserve">0.00 (0.00)</w:t>
+            </w:r>
+          </w:p>
+        </w:tc>
+        <w:tc>
+          <w:tcPr/>
+          <w:p>
+            <w:pPr>
+              <w:pStyle w:val="Compact"/>
+              <w:jc w:val="right"/>
+            </w:pPr>
+            <w:r>
+              <w:t xml:space="preserve">2.39 (6.92)</w:t>
             </w:r>
           </w:p>
         </w:tc>
@@ -3760,19 +4126,19 @@
               <w:jc w:val="right"/>
             </w:pPr>
             <w:r>
-              <w:t xml:space="preserve">92</w:t>
-            </w:r>
-          </w:p>
-        </w:tc>
-        <w:tc>
-          <w:tcPr/>
-          <w:p>
-            <w:pPr>
-              <w:pStyle w:val="Compact"/>
-              <w:jc w:val="right"/>
-            </w:pPr>
-            <w:r>
-              <w:t xml:space="preserve">91</w:t>
+              <w:t xml:space="preserve">100</w:t>
+            </w:r>
+          </w:p>
+        </w:tc>
+        <w:tc>
+          <w:tcPr/>
+          <w:p>
+            <w:pPr>
+              <w:pStyle w:val="Compact"/>
+              <w:jc w:val="right"/>
+            </w:pPr>
+            <w:r>
+              <w:t xml:space="preserve">89</w:t>
             </w:r>
           </w:p>
         </w:tc>
@@ -3783,8 +4149,8 @@
       <w:pPr>
         <w:pStyle w:val="TableCaption"/>
       </w:pPr>
-      <w:bookmarkStart w:id="32" w:name="tab:table-ma-bad"/>
-      <w:bookmarkEnd w:id="32"/>
+      <w:bookmarkStart w:id="36" w:name="tab:table-ma-bad"/>
+      <w:bookmarkEnd w:id="36"/>
       <w:r>
         <w:t xml:space="preserve">Table 4.2: MA(1) implementation, with log-recruitment as random effects. Mean (SD) across 100 replicates.</w:t>
       </w:r>
@@ -3877,31 +4243,31 @@
               <w:jc w:val="right"/>
             </w:pPr>
             <w:r>
-              <w:t xml:space="preserve">0.13 (0.03)</w:t>
-            </w:r>
-          </w:p>
-        </w:tc>
-        <w:tc>
-          <w:tcPr/>
-          <w:p>
-            <w:pPr>
-              <w:pStyle w:val="Compact"/>
-              <w:jc w:val="right"/>
-            </w:pPr>
-            <w:r>
-              <w:t xml:space="preserve">68.64 (19.39)</w:t>
-            </w:r>
-          </w:p>
-        </w:tc>
-        <w:tc>
-          <w:tcPr/>
-          <w:p>
-            <w:pPr>
-              <w:pStyle w:val="Compact"/>
-              <w:jc w:val="right"/>
-            </w:pPr>
-            <w:r>
-              <w:t xml:space="preserve">32.32 (13.29)</w:t>
+              <w:t xml:space="preserve">0.15 (0.03)</w:t>
+            </w:r>
+          </w:p>
+        </w:tc>
+        <w:tc>
+          <w:tcPr/>
+          <w:p>
+            <w:pPr>
+              <w:pStyle w:val="Compact"/>
+              <w:jc w:val="right"/>
+            </w:pPr>
+            <w:r>
+              <w:t xml:space="preserve">58.38 (5.12)</w:t>
+            </w:r>
+          </w:p>
+        </w:tc>
+        <w:tc>
+          <w:tcPr/>
+          <w:p>
+            <w:pPr>
+              <w:pStyle w:val="Compact"/>
+              <w:jc w:val="right"/>
+            </w:pPr>
+            <w:r>
+              <w:t xml:space="preserve">70.30 (4.58)</w:t>
             </w:r>
           </w:p>
         </w:tc>
@@ -3939,19 +4305,19 @@
               <w:jc w:val="right"/>
             </w:pPr>
             <w:r>
-              <w:t xml:space="preserve">1765.39 (333.67)</w:t>
-            </w:r>
-          </w:p>
-        </w:tc>
-        <w:tc>
-          <w:tcPr/>
-          <w:p>
-            <w:pPr>
-              <w:pStyle w:val="Compact"/>
-              <w:jc w:val="right"/>
-            </w:pPr>
-            <w:r>
-              <w:t xml:space="preserve">5781.42 (695.14)</w:t>
+              <w:t xml:space="preserve">1784.86 (283.24)</w:t>
+            </w:r>
+          </w:p>
+        </w:tc>
+        <w:tc>
+          <w:tcPr/>
+          <w:p>
+            <w:pPr>
+              <w:pStyle w:val="Compact"/>
+              <w:jc w:val="right"/>
+            </w:pPr>
+            <w:r>
+              <w:t xml:space="preserve">1773.89 (329.03)</w:t>
             </w:r>
           </w:p>
         </w:tc>
@@ -3989,19 +4355,19 @@
               <w:jc w:val="right"/>
             </w:pPr>
             <w:r>
-              <w:t xml:space="preserve">0.35 (2.81)</w:t>
-            </w:r>
-          </w:p>
-        </w:tc>
-        <w:tc>
-          <w:tcPr/>
-          <w:p>
-            <w:pPr>
-              <w:pStyle w:val="Compact"/>
-              <w:jc w:val="right"/>
-            </w:pPr>
-            <w:r>
-              <w:t xml:space="preserve">0.69 (3.71)</w:t>
+              <w:t xml:space="preserve">0.09 (0.35)</w:t>
+            </w:r>
+          </w:p>
+        </w:tc>
+        <w:tc>
+          <w:tcPr/>
+          <w:p>
+            <w:pPr>
+              <w:pStyle w:val="Compact"/>
+              <w:jc w:val="right"/>
+            </w:pPr>
+            <w:r>
+              <w:t xml:space="preserve">0.49 (4.40)</w:t>
             </w:r>
           </w:p>
         </w:tc>
@@ -4057,8 +4423,8 @@
         </w:tc>
       </w:tr>
     </w:tbl>
-    <w:bookmarkEnd w:id="33"/>
-    <w:bookmarkStart w:id="37" w:name="ar1-models"/>
+    <w:bookmarkEnd w:id="37"/>
+    <w:bookmarkStart w:id="41" w:name="ar1-models"/>
     <w:p>
       <w:pPr>
         <w:pStyle w:val="Heading2"/>
@@ -4123,19 +4489,7 @@
         <w:t xml:space="preserve"> </w:t>
       </w:r>
       <w:r>
-        <w:t xml:space="preserve">– either in RTMB, or with MCMC. Again, the largest difference is the</w:t>
-      </w:r>
-      <w:r>
-        <w:t xml:space="preserve"> </w:t>
-      </w:r>
-      <w:r>
-        <w:t xml:space="preserve">effect of sampling in Stan, which is faster than tmbstan and more</w:t>
-      </w:r>
-      <w:r>
-        <w:t xml:space="preserve"> </w:t>
-      </w:r>
-      <w:r>
-        <w:t xml:space="preserve">efficient (resulting in higher ESS). In comparing the effects of random effects in recruitment deviations versus recruitment (Table</w:t>
+        <w:t xml:space="preserve">– either in RTMB, or with MCMC. Between Stan and tmbstan, both approaches yield similar metrics of efficiency and run time. Comparing the parameterizations of the recruitment formulation vs deviations formulation (Table</w:t>
       </w:r>
       <w:r>
         <w:t xml:space="preserve"> </w:t>
@@ -4153,18 +4507,18 @@
         <w:t xml:space="preserve"> </w:t>
       </w:r>
       <w:r>
-        <w:t xml:space="preserve">4.5</w:t>
-      </w:r>
-      <w:r>
-        <w:t xml:space="preserve">), we see a slight speed up in RTMB when estimating random effects in recruitment. Like the MA(1) comparisons, Stan samples approximately 2x as fast compared to RTMB:tmbstan, and is more efficient (higher ESS); there’s little difference in ESS or speed between Stan implementations of the random effects, but the largest difference occurs for tmbstan.</w:t>
+        <w:t xml:space="preserve">??</w:t>
+      </w:r>
+      <w:r>
+        <w:t xml:space="preserve">) highlights that modeling recuitment results in more efficient sampling (&gt; 2x ESS) in less than half the speed when random effects are included in recruitment, rather than deviations.</w:t>
       </w:r>
     </w:p>
     <w:p>
       <w:pPr>
         <w:pStyle w:val="TableCaption"/>
       </w:pPr>
-      <w:bookmarkStart w:id="34" w:name="tab:table-ar-dautoreg"/>
-      <w:bookmarkEnd w:id="34"/>
+      <w:bookmarkStart w:id="38" w:name="tab:table-ar-dautoreg"/>
+      <w:bookmarkEnd w:id="38"/>
       <w:r>
         <w:t xml:space="preserve">Table 4.3: AR(1) implementation with dautoreg, and log-recruitment as random effects. Mean (SD) across 100 replicates. Because Stan doesn’t have a dautoreg function, we compare against the Stan code without dautoreg.</w:t>
       </w:r>
@@ -4257,31 +4611,31 @@
               <w:jc w:val="right"/>
             </w:pPr>
             <w:r>
-              <w:t xml:space="preserve">0.11 (0.01)</w:t>
-            </w:r>
-          </w:p>
-        </w:tc>
-        <w:tc>
-          <w:tcPr/>
-          <w:p>
-            <w:pPr>
-              <w:pStyle w:val="Compact"/>
-              <w:jc w:val="right"/>
-            </w:pPr>
-            <w:r>
-              <w:t xml:space="preserve">55.85 (7.02)</w:t>
-            </w:r>
-          </w:p>
-        </w:tc>
-        <w:tc>
-          <w:tcPr/>
-          <w:p>
-            <w:pPr>
-              <w:pStyle w:val="Compact"/>
-              <w:jc w:val="right"/>
-            </w:pPr>
-            <w:r>
-              <w:t xml:space="preserve">26.38 (3.83)</w:t>
+              <w:t xml:space="preserve">0.13 (0.01)</w:t>
+            </w:r>
+          </w:p>
+        </w:tc>
+        <w:tc>
+          <w:tcPr/>
+          <w:p>
+            <w:pPr>
+              <w:pStyle w:val="Compact"/>
+              <w:jc w:val="right"/>
+            </w:pPr>
+            <w:r>
+              <w:t xml:space="preserve">NaN (NA)</w:t>
+            </w:r>
+          </w:p>
+        </w:tc>
+        <w:tc>
+          <w:tcPr/>
+          <w:p>
+            <w:pPr>
+              <w:pStyle w:val="Compact"/>
+              <w:jc w:val="right"/>
+            </w:pPr>
+            <w:r>
+              <w:t xml:space="preserve">61.37 (1.80)</w:t>
             </w:r>
           </w:p>
         </w:tc>
@@ -4319,19 +4673,19 @@
               <w:jc w:val="right"/>
             </w:pPr>
             <w:r>
-              <w:t xml:space="preserve">5074.15 (666.92)</w:t>
-            </w:r>
-          </w:p>
-        </w:tc>
-        <w:tc>
-          <w:tcPr/>
-          <w:p>
-            <w:pPr>
-              <w:pStyle w:val="Compact"/>
-              <w:jc w:val="right"/>
-            </w:pPr>
-            <w:r>
-              <w:t xml:space="preserve">6525.88 (748.28)</w:t>
+              <w:t xml:space="preserve">5255.09 (746.27)</w:t>
+            </w:r>
+          </w:p>
+        </w:tc>
+        <w:tc>
+          <w:tcPr/>
+          <w:p>
+            <w:pPr>
+              <w:pStyle w:val="Compact"/>
+              <w:jc w:val="right"/>
+            </w:pPr>
+            <w:r>
+              <w:t xml:space="preserve">5201.46 (846.79)</w:t>
             </w:r>
           </w:p>
         </w:tc>
@@ -4442,8 +4796,8 @@
       <w:pPr>
         <w:pStyle w:val="TableCaption"/>
       </w:pPr>
-      <w:bookmarkStart w:id="35" w:name="tab:table-ar-nodautoreg"/>
-      <w:bookmarkEnd w:id="35"/>
+      <w:bookmarkStart w:id="39" w:name="tab:table-ar-nodautoreg"/>
+      <w:bookmarkEnd w:id="39"/>
       <w:r>
         <w:t xml:space="preserve">Table 4.4: AR(1) implementation without dautoreg, and log-recruitment as random effects. Mean (SD) across 100 replicates.</w:t>
       </w:r>
@@ -4536,31 +4890,31 @@
               <w:jc w:val="right"/>
             </w:pPr>
             <w:r>
-              <w:t xml:space="preserve">0.11 (0.01)</w:t>
-            </w:r>
-          </w:p>
-        </w:tc>
-        <w:tc>
-          <w:tcPr/>
-          <w:p>
-            <w:pPr>
-              <w:pStyle w:val="Compact"/>
-              <w:jc w:val="right"/>
-            </w:pPr>
-            <w:r>
-              <w:t xml:space="preserve">53.87 (5.81)</w:t>
-            </w:r>
-          </w:p>
-        </w:tc>
-        <w:tc>
-          <w:tcPr/>
-          <w:p>
-            <w:pPr>
-              <w:pStyle w:val="Compact"/>
-              <w:jc w:val="right"/>
-            </w:pPr>
-            <w:r>
-              <w:t xml:space="preserve">26.90 (3.32)</w:t>
+              <w:t xml:space="preserve">0.13 (0.02)</w:t>
+            </w:r>
+          </w:p>
+        </w:tc>
+        <w:tc>
+          <w:tcPr/>
+          <w:p>
+            <w:pPr>
+              <w:pStyle w:val="Compact"/>
+              <w:jc w:val="right"/>
+            </w:pPr>
+            <w:r>
+              <w:t xml:space="preserve">48.65 (NA)</w:t>
+            </w:r>
+          </w:p>
+        </w:tc>
+        <w:tc>
+          <w:tcPr/>
+          <w:p>
+            <w:pPr>
+              <w:pStyle w:val="Compact"/>
+              <w:jc w:val="right"/>
+            </w:pPr>
+            <w:r>
+              <w:t xml:space="preserve">66.09 (2.12)</w:t>
             </w:r>
           </w:p>
         </w:tc>
@@ -4598,19 +4952,19 @@
               <w:jc w:val="right"/>
             </w:pPr>
             <w:r>
-              <w:t xml:space="preserve">5065.16 (775.10)</w:t>
-            </w:r>
-          </w:p>
-        </w:tc>
-        <w:tc>
-          <w:tcPr/>
-          <w:p>
-            <w:pPr>
-              <w:pStyle w:val="Compact"/>
-              <w:jc w:val="right"/>
-            </w:pPr>
-            <w:r>
-              <w:t xml:space="preserve">6509.01 (739.18)</w:t>
+              <w:t xml:space="preserve">5110.49 (726.67)</w:t>
+            </w:r>
+          </w:p>
+        </w:tc>
+        <w:tc>
+          <w:tcPr/>
+          <w:p>
+            <w:pPr>
+              <w:pStyle w:val="Compact"/>
+              <w:jc w:val="right"/>
+            </w:pPr>
+            <w:r>
+              <w:t xml:space="preserve">5189.48 (681.30)</w:t>
             </w:r>
           </w:p>
         </w:tc>
@@ -4648,7 +5002,7 @@
               <w:jc w:val="right"/>
             </w:pPr>
             <w:r>
-              <w:t xml:space="preserve">0.01 (0.10)</w:t>
+              <w:t xml:space="preserve">0.00 (0.00)</w:t>
             </w:r>
           </w:p>
         </w:tc>
@@ -4698,7 +5052,7 @@
               <w:jc w:val="right"/>
             </w:pPr>
             <w:r>
-              <w:t xml:space="preserve">99</w:t>
+              <w:t xml:space="preserve">100</w:t>
             </w:r>
           </w:p>
         </w:tc>
@@ -4721,8 +5075,8 @@
       <w:pPr>
         <w:pStyle w:val="TableCaption"/>
       </w:pPr>
-      <w:bookmarkStart w:id="36" w:name="tab:table-ar-deviations"/>
-      <w:bookmarkEnd w:id="36"/>
+      <w:bookmarkStart w:id="40" w:name="tab:table-ar-deviations"/>
+      <w:bookmarkEnd w:id="40"/>
       <w:r>
         <w:t xml:space="preserve">Table 4.5: AR(1) implementation without dautoreg, and deviations as random effects. Mean (SD) across 100 replicates.</w:t>
       </w:r>
@@ -4815,31 +5169,31 @@
               <w:jc w:val="right"/>
             </w:pPr>
             <w:r>
-              <w:t xml:space="preserve">0.14 (0.01)</w:t>
-            </w:r>
-          </w:p>
-        </w:tc>
-        <w:tc>
-          <w:tcPr/>
-          <w:p>
-            <w:pPr>
-              <w:pStyle w:val="Compact"/>
-              <w:jc w:val="right"/>
-            </w:pPr>
-            <w:r>
-              <w:t xml:space="preserve">272.02 (72.15)</w:t>
-            </w:r>
-          </w:p>
-        </w:tc>
-        <w:tc>
-          <w:tcPr/>
-          <w:p>
-            <w:pPr>
-              <w:pStyle w:val="Compact"/>
-              <w:jc w:val="right"/>
-            </w:pPr>
-            <w:r>
-              <w:t xml:space="preserve">111.90 (30.10)</w:t>
+              <w:t xml:space="preserve">0.15 (0.02)</w:t>
+            </w:r>
+          </w:p>
+        </w:tc>
+        <w:tc>
+          <w:tcPr/>
+          <w:p>
+            <w:pPr>
+              <w:pStyle w:val="Compact"/>
+              <w:jc w:val="right"/>
+            </w:pPr>
+            <w:r>
+              <w:t xml:space="preserve">343.87 (706.04)</w:t>
+            </w:r>
+          </w:p>
+        </w:tc>
+        <w:tc>
+          <w:tcPr/>
+          <w:p>
+            <w:pPr>
+              <w:pStyle w:val="Compact"/>
+              <w:jc w:val="right"/>
+            </w:pPr>
+            <w:r>
+              <w:t xml:space="preserve">125.77 (173.69)</w:t>
             </w:r>
           </w:p>
         </w:tc>
@@ -4889,7 +5243,7 @@
               <w:jc w:val="right"/>
             </w:pPr>
             <w:r>
-              <w:t xml:space="preserve">6315.67 (903.40)</w:t>
+              <w:t xml:space="preserve">2202.32 (460.81)</w:t>
             </w:r>
           </w:p>
         </w:tc>
@@ -4995,9 +5349,9 @@
         </w:tc>
       </w:tr>
     </w:tbl>
-    <w:bookmarkEnd w:id="37"/>
-    <w:bookmarkEnd w:id="38"/>
-    <w:bookmarkStart w:id="39" w:name="discussion"/>
+    <w:bookmarkEnd w:id="41"/>
+    <w:bookmarkEnd w:id="42"/>
+    <w:bookmarkStart w:id="43" w:name="discussion"/>
     <w:p>
       <w:pPr>
         <w:pStyle w:val="Heading1"/>
@@ -5066,7 +5420,7 @@
         <w:t xml:space="preserve">function seemed to have little to no impact on MCMC sampling speed or efficiency</w:t>
       </w:r>
     </w:p>
-    <w:bookmarkEnd w:id="39"/>
+    <w:bookmarkEnd w:id="43"/>
     <w:sectPr/>
   </w:body>
 </w:document>

</xml_diff>